<commit_message>
Refine manuscript language and evidence-backed contribution framing
</commit_message>
<xml_diff>
--- a/research_runs/PAPER_FINAL_20261006/cover_letter_JNE.docx
+++ b/research_runs/PAPER_FINAL_20261006/cover_letter_JNE.docx
@@ -29,27 +29,27 @@
     </w:p>
     <w:p>
       <w:r>
-        <w:t>The study examines source-only model selection and fixed spectral sharing in cross-subject motor-imagery EEG. It combines a documented BNCI development programme with separately frozen binary evaluations on PhysioNet, Cho2017 and Lee2019_MI. Zero calibration is defined as absence of target-dependent parameter fitting or target-based model selection. Target labels used for metadata and scoring are distinguished from learning; participant-level uncertainty is retained throughout.</w:t>
+        <w:t>The study examines source-only model selection and the transfer limits of fixed spectral-sharing pipelines. BNCI development analyses are followed by separately frozen binary evaluations on PhysioNet, Cho2017 and Lee2019_MI. Zero calibration means no target-dependent fitting or model selection; label use for metadata and scoring is distinguished from learning. Results and uncertainty are reported at participant level.</w:t>
       </w:r>
     </w:p>
     <w:p>
       <w:r>
-        <w:t>The completed Q15 evaluation covers 52 Cho2017 and 54 Lee2019_MI participants under a prespecified common 21-channel adapter. The shared-input pipeline had 1.513 percentage points lower balanced accuracy on Cho2017 (95% paired-person bootstrap interval −2.249 to −0.804), while the Lee2019_MI difference was small and uncertain (+0.204 points, interval −0.515 to +0.969). The adverse result is reported directly. Comparisons reflect complete frozen pipelines, including their selected training durations.</w:t>
+        <w:t>The frozen Q15 evaluation includes 52 Cho2017 and 54 Lee2019_MI participants under a prespecified common 21-channel adapter. The shared-input pipeline had 1.513 percentage points lower balanced accuracy on Cho2017 (95% paired-person bootstrap interval −2.249 to −0.804); the Lee2019_MI difference was small and uncertain (+0.204 points, interval −0.515 to +0.969). These adverse and uncertain results are retained. The contrasts compare complete pipelines, including their source-selected training durations.</w:t>
       </w:r>
     </w:p>
     <w:p>
       <w:r>
-        <w:t>The revision adds a separately frozen BNCI sensor-level physiological characterization, with fixed baseline/task intervals and participant-level μ/β descriptors. It examines these descriptions alongside saved source-LOSO performance without feeding them back into model selection. The manuscript distinguishes physiological signal description from evidence about what a decoder learned. This component covers nine BNCI participants and does not assert external physiological replication.</w:t>
+        <w:t>A separate BNCI sensor analysis uses fixed baseline/task intervals and participant-level μ/β descriptors, specified after decoder outcomes were known and before the power calculation. Its associations with saved source-LOSO scores are descriptive and do not feed back into model selection. The analysis distinguishes recorded physiology from evidence about decoder mechanisms. It includes nine BNCI participants and has no external physiological replication.</w:t>
       </w:r>
     </w:p>
     <w:p>
       <w:r>
-        <w:t>Code, saved predictions, contracts, event/file provenance and validation receipts accompany the manuscript. Q15 validation reconstructs original-data processing, frozen-checkpoint outputs and prescribed statistics without target fitting. The BNCI power analysis has its own pre-power committed recipe and executed manifest; independent numerical verification passed, including full central-sensor periodogram replay and complete saved-table aggregation checks. Physical export voltage calibration, original Cho acquisition reference and hardware cue latency remain explicit limitations.</w:t>
+        <w:t>The accompanying code, saved predictions, frozen contracts and validation records make the evaluation traceable. Q15 validation reconstructs raw-data processing, frozen-checkpoint outputs and prescribed statistics without target fitting. Independent verification of the BNCI analysis includes full central-sensor periodogram replay and all saved-table aggregations, checked against its committed pre-power recipe and execution manifest. Physical export voltage calibration, the original Cho acquisition reference and hardware cue latency remain unresolved.</w:t>
       </w:r>
     </w:p>
     <w:p>
       <w:r>
-        <w:t>Journal of Neural Engineering provides a relevant audience for reliable BCI evaluation and physiological interpretation. The manuscript shows how source-only duration decisions can produce concentrated gains and how a fixed spectral-sharing pipeline can have lower balanced accuracy under frozen transfer. Its separate sensor-level analysis provides physiological context while retaining the limits of retrospective association. The study does not evaluate online assistive control, patients or rehabilitation outcomes.</w:t>
+        <w:t>The contribution is an empirical audit of source-only model selection and the transfer limits of fixed spectral-sharing pipelines, rather than a new decoding algorithm. Person-level development gains, frozen external contrasts and separate sensor-level descriptions show why an aggregate improvement need not imply broad benefit or a physiological decoder mechanism. These questions concern the reliability and interpretation of BCI evidence, fitting the scope of Journal of Neural Engineering. The study does not evaluate online assistive control, patients or rehabilitation outcomes.</w:t>
       </w:r>
     </w:p>
     <w:p>

</xml_diff>